<commit_message>
Remove process language from final plan
Co-Authored-By: Claude Opus 5.5 <noreply@anthropic.com>
Claude-Session: https://claude.ai/code/session_01DYCMWq3RhJfK6nWEeNKm4R
</commit_message>
<xml_diff>
--- a/Qubik-Launch-Plan-Final.docx
+++ b/Qubik-Launch-Plan-Final.docx
@@ -4186,7 +4186,7 @@
           <w:sz w:val="18"/>
           <w:szCs w:val="18"/>
         </w:rPr>
-        <w:t xml:space="preserve"> The audience check is done. Next: a Meta Ad Library scan for anyone already targeting distributors, five short conversations with distributors Qubik knows, and the automation specialist's sign-off that the check can be delivered in three weeks at a profit.</w:t>
+        <w:t xml:space="preserve"> Meta audience sizing is already done (Section 1). Next: a Meta Ad Library scan for anyone already targeting distributors, five short conversations with distributors Qubik knows, and the automation specialist's sign-off that the check can be delivered in three weeks at a profit.</w:t>
       </w:r>
     </w:p>
     <w:p>
@@ -4308,7 +4308,7 @@
           <w:sz w:val="18"/>
           <w:szCs w:val="18"/>
         </w:rPr>
-        <w:t xml:space="preserve"> the segment came from my Cometlab experience, where similar businesses in India kept describing the same pain; I then tested it against Australian data. My Meta experience targeting older business owners gave me another reason to back this niche. I rejected the AI's first suggestions (trades, then job-shop manufacturers) and sent drafts back when they read as machine-written.</w:t>
+        <w:t xml:space="preserve"> the segment came from my Cometlab experience, where similar businesses in India kept describing the same pain; I then tested it against Australian data. My Meta experience targeting older business owners gave me another reason to back this niche. The AI's first suggestion was trades; I dropped it because only 7% of trade businesses fall in the target revenue band.</w:t>
       </w:r>
     </w:p>
     <w:p>

</xml_diff>

<commit_message>
Reframe problem as invoice processing with container cost as hook; diversify test hooks
Co-Authored-By: Claude Opus 5.5 <noreply@anthropic.com>
Claude-Session: https://claude.ai/code/session_01DYCMWq3RhJfK6nWEeNKm4R
</commit_message>
<xml_diff>
--- a/Qubik-Launch-Plan-Final.docx
+++ b/Qubik-Launch-Plan-Final.docx
@@ -74,7 +74,7 @@
           <w:sz w:val="22"/>
           <w:szCs w:val="22"/>
         </w:rPr>
-        <w:t xml:space="preserve"> Cost increases that never reach sell prices, because container costs arrive late and in pieces</w:t>
+        <w:t xml:space="preserve"> Supplier and freight invoices processed by hand, so costs reach prices late and office hours go on chasing paperwork. Container costing is the hook.</w:t>
       </w:r>
     </w:p>
     <w:p>
@@ -379,7 +379,7 @@
           <w:sz w:val="18"/>
           <w:szCs w:val="18"/>
         </w:rPr>
-        <w:t xml:space="preserve"> A container's costs don't arrive with the container. The supplier invoice comes first, the freight bill later, and the customs broker's invoice, with duty and GST, can land weeks after the stock is on the shelf. Systems like Unleashed can spread these costs and even recalculate margin after sale (Unleashed), so software isn't the gap. The gap is someone chasing three parties for paperwork, with prices reviewed only once it's all in. In Xero-only or MYOB businesses it often lives in a spreadsheet, if anywhere. Meanwhile stock keeps selling at last quarter's price, and it happens again with every container.</w:t>
+        <w:t xml:space="preserve"> Supplier and freight invoice processing. Every purchase creates invoices from suppliers, forwarders and customs brokers that someone has to chase, check, match and key in. Containers are where it hurts most visibly, so that's the hook: a container's costs don't arrive with it. The supplier invoice comes first, the freight bill later, and the broker's invoice, with duty and GST, can land weeks after the stock is on the shelf. Systems like Unleashed can spread these costs and recalculate margin after sale (Unleashed), so software isn't the gap; the manual paperwork feeding it is. Meanwhile stock sells at last quarter's price, and it repeats with every container.</w:t>
       </w:r>
     </w:p>
     <w:p>
@@ -394,15 +394,15 @@
           <w:sz w:val="18"/>
           <w:szCs w:val="18"/>
         </w:rPr>
-        <w:t xml:space="preserve">What it likely costs (my estimate; the diagnostic replaces it with their real numbers).</w:t>
-      </w:r>
-      <w:r>
-        <w:rPr>
-          <w:rFonts w:ascii="Arial" w:cs="Arial" w:eastAsia="Arial" w:hAnsi="Arial"/>
-          <w:sz w:val="18"/>
-          <w:szCs w:val="18"/>
-        </w:rPr>
-        <w:t xml:space="preserve"> Take a A$6M distributor with A$3.6M of imported sales. If freight or the dollar lifts landed costs 5% and prices catch up three months later, that's about A$45k of margin gone. Two such moves a year is around A$90k, before the hours spent chasing paperwork.</w:t>
+        <w:t xml:space="preserve">What it likely costs (my estimate, replaced by real numbers in the diagnostic).</w:t>
+      </w:r>
+      <w:r>
+        <w:rPr>
+          <w:rFonts w:ascii="Arial" w:cs="Arial" w:eastAsia="Arial" w:hAnsi="Arial"/>
+          <w:sz w:val="18"/>
+          <w:szCs w:val="18"/>
+        </w:rPr>
+        <w:t xml:space="preserve"> A A$6M distributor with A$3.6M of imported sales. If freight or the dollar lifts landed costs 5% and prices catch up three months later, that's about A$45k of margin gone; two such moves a year is around A$90k. Add the office time: half a role spent chasing and keying invoices is roughly A$35–40k a year.</w:t>
       </w:r>
     </w:p>
     <w:p>
@@ -425,7 +425,7 @@
           <w:sz w:val="18"/>
           <w:szCs w:val="18"/>
         </w:rPr>
-        <w:t xml:space="preserve"> A freight or currency jump, a quarter where margin seems to have "gone missing", the bookkeeper leaving, or a stocktake that won't reconcile. Timing helps too: Christmas stock is landing now, and with Chinese New Year on 6 February 2027, pre-holiday orders go to factories in November (Sino-Shipping). The paperwork peaks right when this would launch.</w:t>
+        <w:t xml:space="preserve"> A freight or currency jump, a quarter where margin seems to have "gone missing", the bookkeeper leaving, or a stocktake that won't reconcile. Timing helps: Christmas stock is landing now, and pre-Chinese New Year orders (6 February 2027) go to factories in November (Sino-Shipping), so the paperwork peaks at launch.</w:t>
       </w:r>
     </w:p>
     <w:p>
@@ -591,15 +591,15 @@
           <w:sz w:val="18"/>
           <w:szCs w:val="18"/>
         </w:rPr>
-        <w:t xml:space="preserve">The lag:</w:t>
-      </w:r>
-      <w:r>
-        <w:rPr>
-          <w:rFonts w:ascii="Arial" w:cs="Arial" w:eastAsia="Arial" w:hAnsi="Arial"/>
-          <w:sz w:val="18"/>
-          <w:szCs w:val="18"/>
-        </w:rPr>
-        <w:t xml:space="preserve"> days from arrival to fully costed, and who spends how long chasing paperwork.</w:t>
+        <w:t xml:space="preserve">The invoice workload:</w:t>
+      </w:r>
+      <w:r>
+        <w:rPr>
+          <w:rFonts w:ascii="Arial" w:cs="Arial" w:eastAsia="Arial" w:hAnsi="Arial"/>
+          <w:sz w:val="18"/>
+          <w:szCs w:val="18"/>
+        </w:rPr>
+        <w:t xml:space="preserve"> how many supplier, freight and broker invoices a month, how long each takes, and the lag from arrival to fully costed.</w:t>
       </w:r>
     </w:p>
     <w:p>
@@ -691,7 +691,7 @@
           <w:sz w:val="18"/>
           <w:szCs w:val="18"/>
         </w:rPr>
-        <w:t xml:space="preserve"> A "was A$7,500" claim has to reflect a price actually charged (ACCC), so I'd say "A$3,500 for our first ten clients, A$7,500 after that", once Qubik commits. It's true, and gives a reason to act now.</w:t>
+        <w:t xml:space="preserve"> A "was A$7,500" claim has to reflect a price actually charged (ACCC), so I'd say "A$3,500 for our first ten clients, A$7,500 after that", once Qubik commits.</w:t>
       </w:r>
     </w:p>
     <w:p>
@@ -714,7 +714,7 @@
           <w:sz w:val="18"/>
           <w:szCs w:val="18"/>
         </w:rPr>
-        <w:t xml:space="preserve"> Qubik's standing as a Xero Platinum partner since 2013, with CA ANZ and CPA memberships (Xero). The automation specialist, named, showing something they've built. A sample report on clearly labelled dummy data, so buyers see exactly what they'll get. And the founding-client deal itself: the first ten get the lower price in return for anonymised before-and-after results, which is how proof gets built rather than invented.</w:t>
+        <w:t xml:space="preserve"> Qubik's standing as a Xero Platinum partner since 2013, with CA ANZ and CPA memberships (Xero). The automation specialist, named, showing something they've built. A sample report on labelled dummy data. And the founding-client deal: the first ten get the lower price in return for anonymised before-and-after results, so proof is built rather than invented.</w:t>
       </w:r>
     </w:p>
     <w:p>
@@ -737,7 +737,7 @@
           <w:sz w:val="18"/>
           <w:szCs w:val="18"/>
         </w:rPr>
-        <w:t xml:space="preserve"> The check puts a dollar figure on the client's own leak, and that becomes the business case for a build already scoped and priced in the report. The A$3,500 is credited if they go ahead within 30 days. A typical build picks up supplier, freight and broker documents from the inbox as they arrive, matches them to the shipment, posts landed cost into Unleashed, Cin7 or Xero, and produces a weekly list of products below target margin, so prices are reviewed the week a container lands, not a quarter later. Staff approve anything the system isn't sure about, and the number of systems and suppliers sets where it lands in A$57–90k.</w:t>
+        <w:t xml:space="preserve"> The check puts a dollar figure on the client's own leak, and that becomes the business case for a build already scoped and priced in the report. The A$3,500 is credited if they go ahead within 30 days. A typical build automates supplier and freight invoice processing end to end: invoices are picked up from the inbox, read, matched to the purchase order or shipment and posted into Xero, Unleashed or Cin7; landed cost updates as each container's documents arrive; and a weekly list flags products below target margin. Staff approve anything uncertain. Container costing is the visible win; the invoice processing behind it sizes the build within A$57–90k, depending on systems and volume.</w:t>
       </w:r>
     </w:p>
     <w:p>
@@ -827,7 +827,7 @@
           <w:sz w:val="18"/>
           <w:szCs w:val="18"/>
         </w:rPr>
-        <w:t xml:space="preserve"> A real Qubik accountant, filmed on a phone beside a desk of shipping paperwork, talking plainly about a gap owners feel but rarely measure. Advice, not an ad.</w:t>
+        <w:t xml:space="preserve"> A real Qubik accountant, filmed on a phone beside a desk of shipping paperwork, talking plainly. Advice, not an ad.</w:t>
       </w:r>
     </w:p>
     <w:p>
@@ -850,7 +850,7 @@
           <w:sz w:val="18"/>
           <w:szCs w:val="18"/>
         </w:rPr>
-        <w:t xml:space="preserve"> Three hooks in the same ad set, with Meta deciding where spend goes: (A) "Freight went up again. Did your prices?" (B) "The container's landed. Do you know what it actually cost?" (C) "The broker's invoice turned up three weeks after the stock. Sound familiar?" Judged on cost per qualified lead: directional at this budget, but it shows which pain brings the right people forward.</w:t>
+        <w:t xml:space="preserve"> Three hooks in the same ad set, with Meta deciding where spend goes. All three point at the same problem but test a different cost of it: (A) margin: "Freight went up again. Did your prices?" (B) capacity: "Before you hire another person to chase supplier invoices…" (C) risk: "If your office manager left tomorrow, could anyone cost a container?" Judged on cost per qualified lead; if margin doesn't land, spend moves to the winner without changing the offer.</w:t>
       </w:r>
     </w:p>
     <w:p>
@@ -3649,7 +3649,7 @@
           <w:sz w:val="18"/>
           <w:szCs w:val="18"/>
         </w:rPr>
-        <w:t xml:space="preserve"> A$900 buys four to six leads, so the real result is nothing or one sale; it tests the funnel rather than forecasting revenue. The rates are generous too: 7 in 10 attendees buying a diagnostic, and half of those going on to a build. And almost all the revenue is implementation, arriving two to four months later.</w:t>
+        <w:t xml:space="preserve"> A$900 buys four to six leads, so the real result is nothing or one sale: a funnel test, not a forecast. The rates are generous (7 in 10 attendees buy a diagnostic, half of those build), and almost all revenue is implementation, arriving two to four months later.</w:t>
       </w:r>
     </w:p>
     <w:p>
@@ -4099,7 +4099,7 @@
           <w:sz w:val="18"/>
           <w:szCs w:val="18"/>
         </w:rPr>
-        <w:t xml:space="preserve"> Each lead is worth about A$6,000 at the brief's rates, so even a A$600 CPL works if 30% qualify. But only about 3% of the people Meta can reach are real buyers. If the form fills with people who'll never buy, qualification drops to 10–15% and everything downstream shrinks.</w:t>
+        <w:t xml:space="preserve"> Each lead is worth about A$6,000 at the brief's rates, so even a A$600 CPL works if 30% qualify. But only about 3% of the people Meta reaches are real buyers; if the form fills with the rest, qualification drops to 10–15% and everything downstream shrinks.</w:t>
       </w:r>
     </w:p>
     <w:p>
@@ -4265,7 +4265,7 @@
           <w:sz w:val="18"/>
           <w:szCs w:val="18"/>
         </w:rPr>
-        <w:t xml:space="preserve"> that late costing really hurts at this size; document access; willingness to pay A$3,500, then A$57–90k; sales capacity; my cost estimate and band split; pricing, consent and privacy compliance.</w:t>
+        <w:t xml:space="preserve"> that invoice processing really hurts at this size; document access; willingness to pay A$3,500, then A$57–90k; sales capacity; my estimates; pricing, consent and privacy compliance.</w:t>
       </w:r>
     </w:p>
     <w:p>
@@ -4336,7 +4336,7 @@
           <w:sz w:val="18"/>
           <w:szCs w:val="18"/>
         </w:rPr>
-        <w:t xml:space="preserve"> analysed ABS business counts by industry and turnover, pulled Meta audience sizes through read-only API calls, found sources, and drafted text that I rewrote.</w:t>
+        <w:t xml:space="preserve"> analysed ABS business counts, pulled Meta audience sizes via read-only API calls, found sources, and drafted text I rewrote.</w:t>
       </w:r>
     </w:p>
     <w:p>
@@ -4364,16 +4364,12 @@
           <w:sz w:val="18"/>
           <w:szCs w:val="18"/>
         </w:rPr>
-        <w:t xml:space="preserve"> spot-checked ABS figures, verified the Meta numbers in Ads Manager, recalculated the economics by hand, and opened every source, cutting anything I couldn't back.</w:t>
-      </w:r>
-    </w:p>
-    <w:p>
-      <w:r>
-        <w:br w:type="page"/>
-      </w:r>
-    </w:p>
-    <w:p>
-      <w:pPr>
+        <w:t xml:space="preserve"> spot-checked ABS figures, verified the Meta numbers in Ads Manager, recalculated the economics by hand, and checked every source.</w:t>
+      </w:r>
+    </w:p>
+    <w:p>
+      <w:pPr>
+        <w:pageBreakBefore/>
         <w:spacing w:after="100"/>
       </w:pPr>
       <w:r>

</xml_diff>